<commit_message>
Expand method explanations and interpretation in research deliverables
</commit_message>
<xml_diff>
--- a/deliverables/AML_research_report.docx
+++ b/deliverables/AML_research_report.docx
@@ -55,6 +55,11 @@
       </w:r>
     </w:p>
     <w:p>
+      <w:r>
+        <w:t>Each method preserves a different property, so a good two-dimensional picture is not necessarily a good classifier input. PCA keeps directions of greatest overall variance, which may reflect illumination or cell size rather than diagnosis. Kernel PCA can unfold curved structure but depends on kernel scale. MDS and PCoA emphasize global distances; the chosen distance measure determines which differences matter. Isomap estimates distances along a neighbor graph and can help when class information follows a curved manifold, but graph construction can be unstable with sparse or noisy samples. SNE, t-SNE, and UMAP focus on local neighborhoods. Their visual clusters can be useful for exploration, yet cluster separation alone does not establish predictive validity on new records.</w:t>
+      </w:r>
+    </w:p>
+    <w:p>
       <w:pPr>
         <w:pStyle w:val="Heading1"/>
       </w:pPr>
@@ -3459,6 +3464,11 @@
     <w:p>
       <w:r>
         <w:t>In HAM10000, Isomap has the highest mean ROC AUC for setting A (0.649). Kernel PCA uses the least mean CPU time (0.05 s). These are descriptive rankings across only three overlapping splits. Accuracy should be read together with sensitivity and specificity because the positive class is less frequent.</w:t>
+      </w:r>
+    </w:p>
+    <w:p>
+      <w:r>
+        <w:t>Isomap's mean AUC of 0.649 exceeds PCA's 0.602, suggesting that a neighborhood-graph representation may retain more melanoma ranking information in these compressed pixels. This is a hypothesis about the observed data, not proof of an underlying disease manifold. PCA still has slightly higher accuracy (0.609 versus 0.590), showing that ranking quality and decisions at the fixed 0.5 threshold answer different questions. Isomap's precision is only 0.134: many positive predictions are false alarms in this low-prevalence sample. Neither AUC nor accuracy is strong enough here to support a diagnostic claim.</w:t>
       </w:r>
     </w:p>
     <w:p>
@@ -6265,6 +6275,11 @@
     <w:p>
       <w:r>
         <w:t>In Blood cell, PCA has the highest mean ROC AUC for setting A (0.630). PCA uses the least mean CPU time (0.02 s). These are descriptive rankings across only three overlapping splits. Accuracy should be read together with sensitivity and specificity because the positive class is less frequent.</w:t>
+      </w:r>
+    </w:p>
+    <w:p>
+      <w:r>
+        <w:t>PCA has the highest mean AUC on the blood-cell table (0.630) while using about 0.02 CPU seconds, consistent with much of the usable signal being captured by broad linear variation in these selected numeric features. SNE has higher accuracy (0.614) but lower AUC (0.581), because one fixed decision threshold can favor the majority class without ranking anomalous records well. MDS has the lowest AUC (0.562) and high CPU cost (about 1.06 seconds); preserving global Euclidean distances in two coordinates did not preserve the class signal well in this pilot. These explanations remain plausible interpretations rather than established mechanisms.</w:t>
       </w:r>
     </w:p>
     <w:p>

</xml_diff>